<commit_message>
T-0500: WIP handoff to cloud session - Implement in progress (step 3 test run interrupted, unverified)
Claude-Session: https://claude.ai/code/session_01Fa9hmVJxzFpX7o2wZR9WVG
</commit_message>
<xml_diff>
--- a/docs/guides/crew/crew-1.0-quickstart.docx
+++ b/docs/guides/crew/crew-1.0-quickstart.docx
@@ -1098,7 +1098,27 @@
       </w:r>
       <w:r>
         <w:rPr/>
-        <w:t xml:space="preserve"> picks up where it left off.</w:t>
+        <w:t xml:space="preserve"> picks up where it left off. If a phase you marked </w:t>
+      </w:r>
+      <w:r>
+        <w:rPr>
+          <w:rStyle w:val="SourceText"/>
+        </w:rPr>
+        <w:t>done</w:t>
+      </w:r>
+      <w:r>
+        <w:rPr/>
+        <w:t xml:space="preserve"> has changed since, or its note records a breakage, init offers it again first - the checker's </w:t>
+      </w:r>
+      <w:r>
+        <w:rPr>
+          <w:rStyle w:val="SourceText"/>
+        </w:rPr>
+        <w:t>phase N ... - re-verify</w:t>
+      </w:r>
+      <w:r>
+        <w:rPr/>
+        <w:t xml:space="preserve"> lines say why.</w:t>
       </w:r>
     </w:p>
     <w:p>
@@ -1334,13 +1354,55 @@
           <w:tab w:val="left" w:pos="829" w:leader="none"/>
         </w:tabs>
         <w:bidi w:val="0"/>
+        <w:spacing w:before="120" w:after="0"/>
         <w:ind w:hanging="283" w:left="829"/>
         <w:jc w:val="left"/>
         <w:rPr/>
       </w:pPr>
       <w:r>
         <w:rPr/>
-        <w:t xml:space="preserve">the originals it leaves in place and you may retire later. </w:t>
+        <w:t xml:space="preserve">the originals it leaves in place and you may retire later; </w:t>
+      </w:r>
+    </w:p>
+    <w:p>
+      <w:pPr>
+        <w:pStyle w:val="BodyText"/>
+        <w:numPr>
+          <w:ilvl w:val="0"/>
+          <w:numId w:val="1"/>
+        </w:numPr>
+        <w:tabs>
+          <w:tab w:val="clear" w:pos="1134"/>
+          <w:tab w:val="left" w:pos="829" w:leader="none"/>
+        </w:tabs>
+        <w:bidi w:val="0"/>
+        <w:ind w:hanging="283" w:left="829"/>
+        <w:jc w:val="left"/>
+        <w:rPr/>
+      </w:pPr>
+      <w:r>
+        <w:rPr/>
+        <w:t xml:space="preserve">every </w:t>
+      </w:r>
+      <w:r>
+        <w:rPr>
+          <w:rStyle w:val="SourceText"/>
+        </w:rPr>
+        <w:t>done</w:t>
+      </w:r>
+      <w:r>
+        <w:rPr/>
+        <w:t xml:space="preserve"> setup phase that needs re-verifying (a 0.20 status file reads </w:t>
+      </w:r>
+      <w:r>
+        <w:rPr>
+          <w:rStyle w:val="SourceText"/>
+        </w:rPr>
+        <w:t>could not tell when marked</w:t>
+      </w:r>
+      <w:r>
+        <w:rPr/>
+        <w:t xml:space="preserve"> on all of them, once). </w:t>
       </w:r>
     </w:p>
     <w:p>

</xml_diff>

<commit_message>
T-0038: docs, quickstart, diagram, codemap and verify rule for the migrate upgrade stage; harness edits left for a tooling PR
Claude-Session: https://claude.ai/code/session_01YVvVmFJquzLKR26dG6oSQS
</commit_message>
<xml_diff>
--- a/docs/guides/crew/crew-1.0-quickstart.docx
+++ b/docs/guides/crew/crew-1.0-quickstart.docx
@@ -1,6 +1,6 @@
 
 <file path=word/document.xml><?xml version="1.0" encoding="utf-8"?>
-<w:document xmlns:o="urn:schemas-microsoft-com:office:office" xmlns:r="http://schemas.openxmlformats.org/officeDocument/2006/relationships" xmlns:v="urn:schemas-microsoft-com:vml" xmlns:w="http://schemas.openxmlformats.org/wordprocessingml/2006/main" xmlns:w10="urn:schemas-microsoft-com:office:word" xmlns:wp="http://schemas.openxmlformats.org/drawingml/2006/wordprocessingDrawing" xmlns:pic="http://schemas.openxmlformats.org/drawingml/2006/picture" xmlns:wps="http://schemas.microsoft.com/office/word/2010/wordprocessingShape" xmlns:wpg="http://schemas.microsoft.com/office/word/2010/wordprocessingGroup" xmlns:mc="http://schemas.openxmlformats.org/markup-compatibility/2006" xmlns:wp14="http://schemas.microsoft.com/office/word/2010/wordprocessingDrawing" xmlns:w14="http://schemas.microsoft.com/office/word/2010/wordml" xmlns:w15="http://schemas.microsoft.com/office/word/2012/wordml" mc:Ignorable="w14 wp14 w15">
+<w:document xmlns:o="urn:schemas-microsoft-com:office:office" xmlns:r="http://schemas.openxmlformats.org/officeDocument/2006/relationships" xmlns:v="urn:schemas-microsoft-com:vml" xmlns:w="http://schemas.openxmlformats.org/wordprocessingml/2006/main" xmlns:w10="urn:schemas-microsoft-com:office:word" xmlns:wp="http://schemas.openxmlformats.org/drawingml/2006/wordprocessingDrawing" xmlns:wps="http://schemas.microsoft.com/office/word/2010/wordprocessingShape" xmlns:wpg="http://schemas.microsoft.com/office/word/2010/wordprocessingGroup" xmlns:mc="http://schemas.openxmlformats.org/markup-compatibility/2006" xmlns:wp14="http://schemas.microsoft.com/office/word/2010/wordprocessingDrawing" xmlns:w14="http://schemas.microsoft.com/office/word/2010/wordml" xmlns:w15="http://schemas.microsoft.com/office/word/2012/wordml" mc:Ignorable="w14 wp14 w15">
   <w:body>
     <w:p>
       <w:pPr>
@@ -49,7 +49,7 @@
       <w:tblPr>
         <w:tblW w:w="11339" w:type="dxa"/>
         <w:jc w:val="left"/>
-        <w:tblInd w:w="28" w:type="dxa"/>
+        <w:tblInd w:w="0" w:type="dxa"/>
         <w:tblLayout w:type="fixed"/>
         <w:tblCellMar>
           <w:top w:w="28" w:type="dxa"/>
@@ -59,10 +59,10 @@
         </w:tblCellMar>
       </w:tblPr>
       <w:tblGrid>
-        <w:gridCol w:w="387"/>
-        <w:gridCol w:w="4948"/>
-        <w:gridCol w:w="5018"/>
-        <w:gridCol w:w="986"/>
+        <w:gridCol w:w="423"/>
+        <w:gridCol w:w="5148"/>
+        <w:gridCol w:w="4739"/>
+        <w:gridCol w:w="1029"/>
       </w:tblGrid>
       <w:tr>
         <w:trPr>
@@ -70,7 +70,7 @@
         </w:trPr>
         <w:tc>
           <w:tcPr>
-            <w:tcW w:w="387" w:type="dxa"/>
+            <w:tcW w:w="423" w:type="dxa"/>
             <w:tcBorders/>
             <w:vAlign w:val="center"/>
           </w:tcPr>
@@ -92,7 +92,7 @@
         </w:tc>
         <w:tc>
           <w:tcPr>
-            <w:tcW w:w="4948" w:type="dxa"/>
+            <w:tcW w:w="5148" w:type="dxa"/>
             <w:tcBorders/>
             <w:vAlign w:val="center"/>
           </w:tcPr>
@@ -114,7 +114,7 @@
         </w:tc>
         <w:tc>
           <w:tcPr>
-            <w:tcW w:w="5018" w:type="dxa"/>
+            <w:tcW w:w="4739" w:type="dxa"/>
             <w:tcBorders/>
             <w:vAlign w:val="center"/>
           </w:tcPr>
@@ -136,7 +136,7 @@
         </w:tc>
         <w:tc>
           <w:tcPr>
-            <w:tcW w:w="986" w:type="dxa"/>
+            <w:tcW w:w="1029" w:type="dxa"/>
             <w:tcBorders/>
             <w:vAlign w:val="center"/>
           </w:tcPr>
@@ -161,7 +161,7 @@
         <w:trPr/>
         <w:tc>
           <w:tcPr>
-            <w:tcW w:w="387" w:type="dxa"/>
+            <w:tcW w:w="423" w:type="dxa"/>
             <w:tcBorders/>
             <w:vAlign w:val="center"/>
           </w:tcPr>
@@ -182,7 +182,7 @@
         </w:tc>
         <w:tc>
           <w:tcPr>
-            <w:tcW w:w="4948" w:type="dxa"/>
+            <w:tcW w:w="5148" w:type="dxa"/>
             <w:tcBorders/>
             <w:vAlign w:val="center"/>
           </w:tcPr>
@@ -203,7 +203,7 @@
         </w:tc>
         <w:tc>
           <w:tcPr>
-            <w:tcW w:w="5018" w:type="dxa"/>
+            <w:tcW w:w="4739" w:type="dxa"/>
             <w:tcBorders/>
             <w:vAlign w:val="center"/>
           </w:tcPr>
@@ -230,7 +230,7 @@
         </w:tc>
         <w:tc>
           <w:tcPr>
-            <w:tcW w:w="986" w:type="dxa"/>
+            <w:tcW w:w="1029" w:type="dxa"/>
             <w:tcBorders/>
             <w:vAlign w:val="center"/>
           </w:tcPr>
@@ -254,7 +254,7 @@
         <w:trPr/>
         <w:tc>
           <w:tcPr>
-            <w:tcW w:w="387" w:type="dxa"/>
+            <w:tcW w:w="423" w:type="dxa"/>
             <w:tcBorders/>
             <w:vAlign w:val="center"/>
           </w:tcPr>
@@ -275,7 +275,7 @@
         </w:tc>
         <w:tc>
           <w:tcPr>
-            <w:tcW w:w="4948" w:type="dxa"/>
+            <w:tcW w:w="5148" w:type="dxa"/>
             <w:tcBorders/>
             <w:vAlign w:val="center"/>
           </w:tcPr>
@@ -306,7 +306,7 @@
         </w:tc>
         <w:tc>
           <w:tcPr>
-            <w:tcW w:w="5018" w:type="dxa"/>
+            <w:tcW w:w="4739" w:type="dxa"/>
             <w:tcBorders/>
             <w:vAlign w:val="center"/>
           </w:tcPr>
@@ -333,7 +333,7 @@
         </w:tc>
         <w:tc>
           <w:tcPr>
-            <w:tcW w:w="986" w:type="dxa"/>
+            <w:tcW w:w="1029" w:type="dxa"/>
             <w:tcBorders/>
             <w:vAlign w:val="center"/>
           </w:tcPr>
@@ -357,7 +357,7 @@
         <w:trPr/>
         <w:tc>
           <w:tcPr>
-            <w:tcW w:w="387" w:type="dxa"/>
+            <w:tcW w:w="423" w:type="dxa"/>
             <w:tcBorders/>
             <w:vAlign w:val="center"/>
           </w:tcPr>
@@ -378,7 +378,7 @@
         </w:tc>
         <w:tc>
           <w:tcPr>
-            <w:tcW w:w="4948" w:type="dxa"/>
+            <w:tcW w:w="5148" w:type="dxa"/>
             <w:tcBorders/>
             <w:vAlign w:val="center"/>
           </w:tcPr>
@@ -405,7 +405,7 @@
         </w:tc>
         <w:tc>
           <w:tcPr>
-            <w:tcW w:w="5018" w:type="dxa"/>
+            <w:tcW w:w="4739" w:type="dxa"/>
             <w:tcBorders/>
             <w:vAlign w:val="center"/>
           </w:tcPr>
@@ -442,7 +442,7 @@
         </w:tc>
         <w:tc>
           <w:tcPr>
-            <w:tcW w:w="986" w:type="dxa"/>
+            <w:tcW w:w="1029" w:type="dxa"/>
             <w:tcBorders/>
             <w:vAlign w:val="center"/>
           </w:tcPr>
@@ -466,7 +466,7 @@
         <w:trPr/>
         <w:tc>
           <w:tcPr>
-            <w:tcW w:w="387" w:type="dxa"/>
+            <w:tcW w:w="423" w:type="dxa"/>
             <w:tcBorders/>
             <w:vAlign w:val="center"/>
           </w:tcPr>
@@ -487,7 +487,7 @@
         </w:tc>
         <w:tc>
           <w:tcPr>
-            <w:tcW w:w="4948" w:type="dxa"/>
+            <w:tcW w:w="5148" w:type="dxa"/>
             <w:tcBorders/>
             <w:vAlign w:val="center"/>
           </w:tcPr>
@@ -502,7 +502,7 @@
             </w:pPr>
             <w:r>
               <w:rPr/>
-              <w:t xml:space="preserve">Existing 0.20 repos only: </w:t>
+              <w:t xml:space="preserve">Existing 0.20 or older repos: </w:t>
             </w:r>
             <w:r>
               <w:rPr>
@@ -514,7 +514,7 @@
         </w:tc>
         <w:tc>
           <w:tcPr>
-            <w:tcW w:w="5018" w:type="dxa"/>
+            <w:tcW w:w="4739" w:type="dxa"/>
             <w:tcBorders/>
             <w:vAlign w:val="center"/>
           </w:tcPr>
@@ -547,7 +547,7 @@
         </w:tc>
         <w:tc>
           <w:tcPr>
-            <w:tcW w:w="986" w:type="dxa"/>
+            <w:tcW w:w="1029" w:type="dxa"/>
             <w:tcBorders/>
             <w:vAlign w:val="center"/>
           </w:tcPr>
@@ -571,7 +571,7 @@
         <w:trPr/>
         <w:tc>
           <w:tcPr>
-            <w:tcW w:w="387" w:type="dxa"/>
+            <w:tcW w:w="423" w:type="dxa"/>
             <w:tcBorders/>
             <w:vAlign w:val="center"/>
           </w:tcPr>
@@ -592,7 +592,7 @@
         </w:tc>
         <w:tc>
           <w:tcPr>
-            <w:tcW w:w="4948" w:type="dxa"/>
+            <w:tcW w:w="5148" w:type="dxa"/>
             <w:tcBorders/>
             <w:vAlign w:val="center"/>
           </w:tcPr>
@@ -613,7 +613,7 @@
         </w:tc>
         <w:tc>
           <w:tcPr>
-            <w:tcW w:w="5018" w:type="dxa"/>
+            <w:tcW w:w="4739" w:type="dxa"/>
             <w:tcBorders/>
             <w:vAlign w:val="center"/>
           </w:tcPr>
@@ -640,7 +640,7 @@
         </w:tc>
         <w:tc>
           <w:tcPr>
-            <w:tcW w:w="986" w:type="dxa"/>
+            <w:tcW w:w="1029" w:type="dxa"/>
             <w:tcBorders/>
             <w:vAlign w:val="center"/>
           </w:tcPr>
@@ -1199,7 +1199,7 @@
       </w:pPr>
       <w:r>
         <w:rPr/>
-        <w:t xml:space="preserve">If the repository already used crew 0.20, or you just ran </w:t>
+        <w:t xml:space="preserve">If the repository already used crew 0.20 or earlier (an older config is upgraded in the same run), or you just ran </w:t>
       </w:r>
       <w:r>
         <w:rPr>
@@ -1893,7 +1893,7 @@
       <w:tblPr>
         <w:tblW w:w="11339" w:type="dxa"/>
         <w:jc w:val="left"/>
-        <w:tblInd w:w="28" w:type="dxa"/>
+        <w:tblInd w:w="0" w:type="dxa"/>
         <w:tblLayout w:type="fixed"/>
         <w:tblCellMar>
           <w:top w:w="28" w:type="dxa"/>
@@ -1903,8 +1903,8 @@
         </w:tblCellMar>
       </w:tblPr>
       <w:tblGrid>
-        <w:gridCol w:w="4022"/>
-        <w:gridCol w:w="7317"/>
+        <w:gridCol w:w="4041"/>
+        <w:gridCol w:w="7298"/>
       </w:tblGrid>
       <w:tr>
         <w:trPr>
@@ -1912,7 +1912,7 @@
         </w:trPr>
         <w:tc>
           <w:tcPr>
-            <w:tcW w:w="4022" w:type="dxa"/>
+            <w:tcW w:w="4041" w:type="dxa"/>
             <w:tcBorders/>
             <w:vAlign w:val="center"/>
           </w:tcPr>
@@ -1934,7 +1934,7 @@
         </w:tc>
         <w:tc>
           <w:tcPr>
-            <w:tcW w:w="7317" w:type="dxa"/>
+            <w:tcW w:w="7298" w:type="dxa"/>
             <w:tcBorders/>
             <w:vAlign w:val="center"/>
           </w:tcPr>
@@ -1959,7 +1959,7 @@
         <w:trPr/>
         <w:tc>
           <w:tcPr>
-            <w:tcW w:w="4022" w:type="dxa"/>
+            <w:tcW w:w="4041" w:type="dxa"/>
             <w:tcBorders/>
             <w:vAlign w:val="center"/>
           </w:tcPr>
@@ -1986,7 +1986,7 @@
         </w:tc>
         <w:tc>
           <w:tcPr>
-            <w:tcW w:w="7317" w:type="dxa"/>
+            <w:tcW w:w="7298" w:type="dxa"/>
             <w:tcBorders/>
             <w:vAlign w:val="center"/>
           </w:tcPr>
@@ -2022,7 +2022,7 @@
         <w:trPr/>
         <w:tc>
           <w:tcPr>
-            <w:tcW w:w="4022" w:type="dxa"/>
+            <w:tcW w:w="4041" w:type="dxa"/>
             <w:tcBorders/>
             <w:vAlign w:val="center"/>
           </w:tcPr>
@@ -2055,7 +2055,7 @@
         </w:tc>
         <w:tc>
           <w:tcPr>
-            <w:tcW w:w="7317" w:type="dxa"/>
+            <w:tcW w:w="7298" w:type="dxa"/>
             <w:tcBorders/>
             <w:vAlign w:val="center"/>
           </w:tcPr>
@@ -2079,7 +2079,7 @@
         <w:trPr/>
         <w:tc>
           <w:tcPr>
-            <w:tcW w:w="4022" w:type="dxa"/>
+            <w:tcW w:w="4041" w:type="dxa"/>
             <w:tcBorders/>
             <w:vAlign w:val="center"/>
           </w:tcPr>
@@ -2106,7 +2106,7 @@
         </w:tc>
         <w:tc>
           <w:tcPr>
-            <w:tcW w:w="7317" w:type="dxa"/>
+            <w:tcW w:w="7298" w:type="dxa"/>
             <w:tcBorders/>
             <w:vAlign w:val="center"/>
           </w:tcPr>
@@ -2136,7 +2136,7 @@
         <w:trPr/>
         <w:tc>
           <w:tcPr>
-            <w:tcW w:w="4022" w:type="dxa"/>
+            <w:tcW w:w="4041" w:type="dxa"/>
             <w:tcBorders/>
             <w:vAlign w:val="center"/>
           </w:tcPr>
@@ -2157,7 +2157,7 @@
         </w:tc>
         <w:tc>
           <w:tcPr>
-            <w:tcW w:w="7317" w:type="dxa"/>
+            <w:tcW w:w="7298" w:type="dxa"/>
             <w:tcBorders/>
             <w:vAlign w:val="center"/>
           </w:tcPr>
@@ -2380,7 +2380,7 @@
       <w:start w:val="1"/>
       <w:numFmt w:val="none"/>
       <w:suff w:val="nothing"/>
-      <w:lvlText w:val=""/>
+      <w:lvlText w:val="%1"/>
       <w:lvlJc w:val="left"/>
       <w:pPr>
         <w:tabs>
@@ -2391,10 +2391,10 @@
     </w:lvl>
     <w:lvl w:ilvl="1">
       <w:start w:val="1"/>
+      <w:pStyle w:val="Heading2"/>
       <w:numFmt w:val="none"/>
-      <w:pStyle w:val="Heading2"/>
       <w:suff w:val="nothing"/>
-      <w:lvlText w:val=""/>
+      <w:lvlText w:val="%2"/>
       <w:lvlJc w:val="left"/>
       <w:pPr>
         <w:tabs>
@@ -2405,10 +2405,10 @@
     </w:lvl>
     <w:lvl w:ilvl="2">
       <w:start w:val="1"/>
+      <w:pStyle w:val="Heading3"/>
       <w:numFmt w:val="none"/>
-      <w:pStyle w:val="Heading3"/>
       <w:suff w:val="nothing"/>
-      <w:lvlText w:val=""/>
+      <w:lvlText w:val="%3"/>
       <w:lvlJc w:val="left"/>
       <w:pPr>
         <w:tabs>
@@ -2421,7 +2421,7 @@
       <w:start w:val="1"/>
       <w:numFmt w:val="none"/>
       <w:suff w:val="nothing"/>
-      <w:lvlText w:val=""/>
+      <w:lvlText w:val="%4"/>
       <w:lvlJc w:val="left"/>
       <w:pPr>
         <w:tabs>
@@ -2434,7 +2434,7 @@
       <w:start w:val="1"/>
       <w:numFmt w:val="none"/>
       <w:suff w:val="nothing"/>
-      <w:lvlText w:val=""/>
+      <w:lvlText w:val="%5"/>
       <w:lvlJc w:val="left"/>
       <w:pPr>
         <w:tabs>
@@ -2447,7 +2447,7 @@
       <w:start w:val="1"/>
       <w:numFmt w:val="none"/>
       <w:suff w:val="nothing"/>
-      <w:lvlText w:val=""/>
+      <w:lvlText w:val="%6"/>
       <w:lvlJc w:val="left"/>
       <w:pPr>
         <w:tabs>
@@ -2460,7 +2460,7 @@
       <w:start w:val="1"/>
       <w:numFmt w:val="none"/>
       <w:suff w:val="nothing"/>
-      <w:lvlText w:val=""/>
+      <w:lvlText w:val="%7"/>
       <w:lvlJc w:val="left"/>
       <w:pPr>
         <w:tabs>
@@ -2473,7 +2473,7 @@
       <w:start w:val="1"/>
       <w:numFmt w:val="none"/>
       <w:suff w:val="nothing"/>
-      <w:lvlText w:val=""/>
+      <w:lvlText w:val="%8"/>
       <w:lvlJc w:val="left"/>
       <w:pPr>
         <w:tabs>
@@ -2486,7 +2486,7 @@
       <w:start w:val="1"/>
       <w:numFmt w:val="none"/>
       <w:suff w:val="nothing"/>
-      <w:lvlText w:val=""/>
+      <w:lvlText w:val="%9"/>
       <w:lvlJc w:val="left"/>
       <w:pPr>
         <w:tabs>
@@ -2510,7 +2510,7 @@
   <w:docDefaults>
     <w:rPrDefault>
       <w:rPr>
-        <w:rFonts w:ascii="Liberation Serif" w:hAnsi="Liberation Serif" w:eastAsia="Noto Serif CJK SC" w:cs="Noto Sans Devanagari"/>
+        <w:rFonts w:ascii="Liberation Serif" w:hAnsi="Liberation Serif" w:eastAsia="WenQuanYi Zen Hei" w:cs="FreeSans"/>
         <w:sz w:val="24"/>
         <w:szCs w:val="24"/>
         <w:lang w:val="en-US" w:eastAsia="zh-CN" w:bidi="hi-IN"/>
@@ -2540,7 +2540,7 @@
     </w:rPr>
   </w:style>
   <w:style w:type="paragraph" w:styleId="Heading1">
-    <w:name w:val="heading 1"/>
+    <w:name w:val="Heading 1"/>
     <w:basedOn w:val="Heading"/>
     <w:next w:val="BodyText"/>
     <w:qFormat/>
@@ -2548,6 +2548,7 @@
       <w:spacing w:before="240" w:after="80"/>
     </w:pPr>
     <w:rPr>
+      <w:rFonts w:ascii="Noto Sans" w:hAnsi="Noto Sans"/>
       <w:b/>
       <w:bCs/>
       <w:color w:val="88C0D0"/>
@@ -2556,7 +2557,7 @@
     </w:rPr>
   </w:style>
   <w:style w:type="paragraph" w:styleId="Heading2">
-    <w:name w:val="heading 2"/>
+    <w:name w:val="Heading 2"/>
     <w:basedOn w:val="Heading"/>
     <w:next w:val="BodyText"/>
     <w:qFormat/>
@@ -2569,7 +2570,7 @@
       <w:outlineLvl w:val="1"/>
     </w:pPr>
     <w:rPr>
-      <w:rFonts w:ascii="Liberation Serif" w:hAnsi="Liberation Serif" w:eastAsia="Noto Serif CJK SC" w:cs="Noto Sans Devanagari"/>
+      <w:rFonts w:ascii="Liberation Serif" w:hAnsi="Liberation Serif" w:eastAsia="WenQuanYi Zen Hei" w:cs="FreeSans"/>
       <w:b/>
       <w:bCs/>
       <w:color w:val="88C0D0"/>
@@ -2578,7 +2579,7 @@
     </w:rPr>
   </w:style>
   <w:style w:type="paragraph" w:styleId="Heading3">
-    <w:name w:val="heading 3"/>
+    <w:name w:val="Heading 3"/>
     <w:basedOn w:val="Heading"/>
     <w:next w:val="BodyText"/>
     <w:qFormat/>
@@ -2588,24 +2589,12 @@
       <w:outlineLvl w:val="2"/>
     </w:pPr>
     <w:rPr>
-      <w:rFonts w:ascii="Liberation Serif" w:hAnsi="Liberation Serif" w:eastAsia="Noto Serif CJK SC" w:cs="Noto Sans Devanagari"/>
+      <w:rFonts w:ascii="Liberation Serif" w:hAnsi="Liberation Serif" w:eastAsia="WenQuanYi Zen Hei" w:cs="FreeSans"/>
       <w:b/>
       <w:bCs/>
       <w:color w:val="88C0D0"/>
       <w:sz w:val="26"/>
       <w:szCs w:val="26"/>
-    </w:rPr>
-  </w:style>
-  <w:style w:type="character" w:styleId="EndnoteReference">
-    <w:name w:val="endnote reference"/>
-    <w:rPr>
-      <w:vertAlign w:val="superscript"/>
-    </w:rPr>
-  </w:style>
-  <w:style w:type="character" w:styleId="FootnoteReference">
-    <w:name w:val="footnote reference"/>
-    <w:rPr>
-      <w:vertAlign w:val="superscript"/>
     </w:rPr>
   </w:style>
   <w:style w:type="character" w:styleId="EndnoteCharacters">
@@ -2672,7 +2661,7 @@
     </w:rPr>
   </w:style>
   <w:style w:type="paragraph" w:styleId="EnvelopeReturn">
-    <w:name w:val="envelope return"/>
+    <w:name w:val="Envelope Return"/>
     <w:basedOn w:val="Normal"/>
     <w:pPr/>
     <w:rPr>
@@ -2691,6 +2680,46 @@
       <w:color w:val="ECEFF4"/>
     </w:rPr>
   </w:style>
+  <w:style w:type="paragraph" w:styleId="Footer">
+    <w:name w:val="Footer"/>
+    <w:basedOn w:val="Normal"/>
+    <w:pPr>
+      <w:suppressLineNumbers/>
+      <w:tabs>
+        <w:tab w:val="clear" w:pos="1134"/>
+        <w:tab w:val="center" w:pos="5952" w:leader="none"/>
+        <w:tab w:val="right" w:pos="10771" w:leader="none"/>
+      </w:tabs>
+    </w:pPr>
+    <w:rPr/>
+  </w:style>
+  <w:style w:type="paragraph" w:styleId="Header">
+    <w:name w:val="Header"/>
+    <w:basedOn w:val="Normal"/>
+    <w:pPr>
+      <w:suppressLineNumbers/>
+      <w:tabs>
+        <w:tab w:val="clear" w:pos="1134"/>
+        <w:tab w:val="center" w:pos="5952" w:leader="none"/>
+        <w:tab w:val="right" w:pos="10771" w:leader="none"/>
+      </w:tabs>
+    </w:pPr>
+    <w:rPr/>
+  </w:style>
+  <w:style w:type="paragraph" w:styleId="HeaderandFooter">
+    <w:name w:val="Header and Footer"/>
+    <w:basedOn w:val="Normal"/>
+    <w:qFormat/>
+    <w:pPr>
+      <w:suppressLineNumbers/>
+      <w:tabs>
+        <w:tab w:val="clear" w:pos="1134"/>
+        <w:tab w:val="center" w:pos="5953" w:leader="none"/>
+        <w:tab w:val="right" w:pos="10772" w:leader="none"/>
+      </w:tabs>
+    </w:pPr>
+    <w:rPr/>
+  </w:style>
   <w:style w:type="paragraph" w:styleId="Index">
     <w:name w:val="Index"/>
     <w:basedOn w:val="Normal"/>
@@ -2699,11 +2728,11 @@
       <w:suppressLineNumbers/>
     </w:pPr>
     <w:rPr>
-      <w:rFonts w:cs="Noto Sans Devanagari"/>
+      <w:rFonts w:cs="FreeSans"/>
     </w:rPr>
   </w:style>
   <w:style w:type="paragraph" w:styleId="Caption">
-    <w:name w:val="caption"/>
+    <w:name w:val="Caption"/>
     <w:basedOn w:val="Normal"/>
     <w:qFormat/>
     <w:pPr>
@@ -2711,7 +2740,7 @@
       <w:spacing w:before="120" w:after="120"/>
     </w:pPr>
     <w:rPr>
-      <w:rFonts w:cs="Noto Sans Devanagari"/>
+      <w:rFonts w:cs="FreeSans"/>
       <w:i/>
       <w:iCs/>
       <w:sz w:val="24"/>
@@ -2723,7 +2752,7 @@
     <w:basedOn w:val="BodyText"/>
     <w:pPr/>
     <w:rPr>
-      <w:rFonts w:cs="Noto Sans Devanagari"/>
+      <w:rFonts w:cs="FreeSans"/>
     </w:rPr>
   </w:style>
   <w:style w:type="paragraph" w:styleId="BodyText">
@@ -2765,7 +2794,7 @@
       <w:ind w:left="160" w:right="160"/>
     </w:pPr>
     <w:rPr>
-      <w:rFonts w:ascii="Liberation Mono" w:hAnsi="Liberation Mono" w:eastAsia="Noto Sans Mono CJK SC" w:cs="Liberation Mono"/>
+      <w:rFonts w:ascii="Liberation Mono" w:hAnsi="Liberation Mono" w:eastAsia="Liberation Mono" w:cs="Liberation Mono"/>
       <w:sz w:val="20"/>
       <w:szCs w:val="20"/>
     </w:rPr>
@@ -2796,37 +2825,37 @@
         <a:srgbClr val="000000"/>
       </a:dk1>
       <a:lt1>
-        <a:srgbClr val="FFFFFF"/>
+        <a:srgbClr val="ffffff"/>
       </a:lt1>
       <a:dk2>
         <a:srgbClr val="000000"/>
       </a:dk2>
       <a:lt2>
-        <a:srgbClr val="FFFFFF"/>
+        <a:srgbClr val="ffffff"/>
       </a:lt2>
       <a:accent1>
-        <a:srgbClr val="18A303"/>
+        <a:srgbClr val="18a303"/>
       </a:accent1>
       <a:accent2>
-        <a:srgbClr val="0369A3"/>
+        <a:srgbClr val="0369a3"/>
       </a:accent2>
       <a:accent3>
-        <a:srgbClr val="A33E03"/>
+        <a:srgbClr val="a33e03"/>
       </a:accent3>
       <a:accent4>
-        <a:srgbClr val="8E03A3"/>
+        <a:srgbClr val="8e03a3"/>
       </a:accent4>
       <a:accent5>
-        <a:srgbClr val="C99C00"/>
+        <a:srgbClr val="c99c00"/>
       </a:accent5>
       <a:accent6>
-        <a:srgbClr val="C9211E"/>
+        <a:srgbClr val="c9211e"/>
       </a:accent6>
       <a:hlink>
-        <a:srgbClr val="0000EE"/>
+        <a:srgbClr val="0000ee"/>
       </a:hlink>
       <a:folHlink>
-        <a:srgbClr val="551A8B"/>
+        <a:srgbClr val="551a8b"/>
       </a:folHlink>
     </a:clrScheme>
     <a:fontScheme name="Office">

</xml_diff>